<commit_message>
docs: registrar en la bitacora los ajustes de login y registro
</commit_message>
<xml_diff>
--- a/carrasco-store/docs/Bitacora-Auditoria-Casos-de-Uso.docx
+++ b/carrasco-store/docs/Bitacora-Auditoria-Casos-de-Uso.docx
@@ -2140,11 +2140,32 @@
           </w:tcPr>
           <w:p>
             <w:pPr>
+              <w:pStyle w:val="Prrafodelista"/>
+              <w:numPr>
+                <w:ilvl w:val="0"/>
+                <w:numId w:val="2"/>
+              </w:numPr>
               <w:spacing w:line="276" w:lineRule="auto"/>
+              <w:ind w:left="166" w:hanging="142"/>
               <w:jc w:val="both"/>
             </w:pPr>
             <w:r>
-              <w:t xml:space="preserve">Al momento de elegir una contraseña, usa los mejores estándares en tema de seguridad para que la contraseña sea segura, aplícala y que sea visible para el usuario a medida que va escribiendo algo. Y agrega un botón de ojo para que el usuario pueda ver lo que ha escrito. Además, cuando el usuario le da a “Registrarse”, muestra un mensaje “Cuenta registrada…”, en lugar de eso debería mostrar un mensaje de “Revisa tu correo…” y redirigirlo a </w:t>
+              <w:t xml:space="preserve">Al momento de elegir una contraseña, usa los mejores estándares en tema de seguridad para que la contraseña sea segura, aplícala y que sea visible para el usuario a medida que va escribiendo algo. </w:t>
+            </w:r>
+          </w:p>
+          <w:p>
+            <w:pPr>
+              <w:pStyle w:val="Prrafodelista"/>
+              <w:numPr>
+                <w:ilvl w:val="0"/>
+                <w:numId w:val="2"/>
+              </w:numPr>
+              <w:spacing w:line="276" w:lineRule="auto"/>
+              <w:ind w:left="166" w:hanging="142"/>
+              <w:jc w:val="both"/>
+            </w:pPr>
+            <w:r>
+              <w:t xml:space="preserve">Y agrega un botón de ojo para que el usuario pueda ver lo que ha escrito. Además, cuando el usuario le da a “Registrarse”, muestra un mensaje “Cuenta registrada…”, en lugar de eso debería mostrar un mensaje de “Revisa tu correo…” y redirigirlo a </w:t>
             </w:r>
             <w:hyperlink r:id="rId11" w:history="1">
               <w:r>
@@ -2160,7 +2181,13 @@
           </w:p>
           <w:p>
             <w:pPr>
+              <w:pStyle w:val="Prrafodelista"/>
+              <w:numPr>
+                <w:ilvl w:val="0"/>
+                <w:numId w:val="2"/>
+              </w:numPr>
               <w:spacing w:line="276" w:lineRule="auto"/>
+              <w:ind w:left="166" w:hanging="142"/>
               <w:jc w:val="both"/>
             </w:pPr>
             <w:r>
@@ -2219,6 +2246,9 @@
             </w:pPr>
             <w:r>
               <w:t>Corregido en los commits e6c8600 y 82169a0. Contraseña: mínimo 8 caracteres con mayúscula, minúscula y número, con lista en vivo de lo que falta; botón de ojo para ver lo escrito. El mínimo y las mayúsculas, minúsculas y números también se exigen en Supabase Auth. Correo ya registrado: ahora se avisa explícitamente con enlace a iniciar sesión (revierte la generalización de seguridad previa, por decisión del usuario). Tras registrarse se redirige a /login con el aviso «Cuenta creada. Revisa tu correo para confirmarla antes de ingresar.». Verificado en el navegador (requisitos y ojo). La rama de correo duplicado no se probó en vivo para no crear cuentas reales en producción. Pendiente por decisión del usuario: el símbolo solo se exige en pantalla, no en el servidor.</w:t>
+            </w:r>
+            <w:r>
+              <w:t xml:space="preserve"> Ajuste posterior (commits 2877c4e y 46ee60b): el aviso «Cuenta creada. Revisa tu correo…» ahora sale en un modal, y la confirmación de contraseña también tiene el botón de ojo con el mismo estilo ovalado que los demás campos. Verificado en el navegador (mismo ancho, alto y radio en los tres campos).</w:t>
             </w:r>
           </w:p>
         </w:tc>
@@ -2574,6 +2604,9 @@
             <w:r>
               <w:t>Corregido en el commit e6c8600. Botón de ojo en el campo de contraseña. Verificado en el navegador: el campo alterna entre texto y puntos y el botón indica su estado.</w:t>
             </w:r>
+            <w:r>
+              <w:t xml:space="preserve"> Ajuste posterior (commit 2877c4e): los errores de inicio de sesión salen en un modal. Si el correo aún no está confirmado, ahora se indica que hay que confirmarlo (antes decía «Correo o contraseña incorrectos», lo que era erróneo). Verificado en el navegador con /login?registro=1; el caso de correo sin confirmar no se probó en vivo.</w:t>
+            </w:r>
           </w:p>
         </w:tc>
       </w:tr>
@@ -2631,6 +2664,7 @@
                 <w:sz w:val="22"/>
                 <w:szCs w:val="22"/>
               </w:rPr>
+              <w:lastRenderedPageBreak/>
               <w:t>CU-V10 — Solicitar recuperación de contraseña</w:t>
             </w:r>
           </w:p>
@@ -2659,7 +2693,6 @@
                 <w:sz w:val="19"/>
                 <w:szCs w:val="19"/>
               </w:rPr>
-              <w:lastRenderedPageBreak/>
               <w:t>Estado</w:t>
             </w:r>
           </w:p>
@@ -3446,11 +3479,126 @@
       </w:pPr>
     </w:lvl>
   </w:abstractNum>
+  <w:abstractNum w:abstractNumId="1" w15:restartNumberingAfterBreak="0">
+    <w:nsid w:val="21987656"/>
+    <w:multiLevelType w:val="hybridMultilevel"/>
+    <w:tmpl w:val="BC824BEA"/>
+    <w:lvl w:ilvl="0" w:tplc="FA4CC7BA">
+      <w:numFmt w:val="bullet"/>
+      <w:lvlText w:val="-"/>
+      <w:lvlJc w:val="left"/>
+      <w:pPr>
+        <w:ind w:left="720" w:hanging="360"/>
+      </w:pPr>
+      <w:rPr>
+        <w:rFonts w:ascii="Calibri" w:eastAsia="Calibri" w:hAnsi="Calibri" w:cs="Calibri" w:hint="default"/>
+      </w:rPr>
+    </w:lvl>
+    <w:lvl w:ilvl="1" w:tplc="0C0A0003" w:tentative="1">
+      <w:start w:val="1"/>
+      <w:numFmt w:val="bullet"/>
+      <w:lvlText w:val="o"/>
+      <w:lvlJc w:val="left"/>
+      <w:pPr>
+        <w:ind w:left="1440" w:hanging="360"/>
+      </w:pPr>
+      <w:rPr>
+        <w:rFonts w:ascii="Courier New" w:hAnsi="Courier New" w:cs="Courier New" w:hint="default"/>
+      </w:rPr>
+    </w:lvl>
+    <w:lvl w:ilvl="2" w:tplc="0C0A0005" w:tentative="1">
+      <w:start w:val="1"/>
+      <w:numFmt w:val="bullet"/>
+      <w:lvlText w:val=""/>
+      <w:lvlJc w:val="left"/>
+      <w:pPr>
+        <w:ind w:left="2160" w:hanging="360"/>
+      </w:pPr>
+      <w:rPr>
+        <w:rFonts w:ascii="Wingdings" w:hAnsi="Wingdings" w:hint="default"/>
+      </w:rPr>
+    </w:lvl>
+    <w:lvl w:ilvl="3" w:tplc="0C0A0001" w:tentative="1">
+      <w:start w:val="1"/>
+      <w:numFmt w:val="bullet"/>
+      <w:lvlText w:val=""/>
+      <w:lvlJc w:val="left"/>
+      <w:pPr>
+        <w:ind w:left="2880" w:hanging="360"/>
+      </w:pPr>
+      <w:rPr>
+        <w:rFonts w:ascii="Symbol" w:hAnsi="Symbol" w:hint="default"/>
+      </w:rPr>
+    </w:lvl>
+    <w:lvl w:ilvl="4" w:tplc="0C0A0003" w:tentative="1">
+      <w:start w:val="1"/>
+      <w:numFmt w:val="bullet"/>
+      <w:lvlText w:val="o"/>
+      <w:lvlJc w:val="left"/>
+      <w:pPr>
+        <w:ind w:left="3600" w:hanging="360"/>
+      </w:pPr>
+      <w:rPr>
+        <w:rFonts w:ascii="Courier New" w:hAnsi="Courier New" w:cs="Courier New" w:hint="default"/>
+      </w:rPr>
+    </w:lvl>
+    <w:lvl w:ilvl="5" w:tplc="0C0A0005" w:tentative="1">
+      <w:start w:val="1"/>
+      <w:numFmt w:val="bullet"/>
+      <w:lvlText w:val=""/>
+      <w:lvlJc w:val="left"/>
+      <w:pPr>
+        <w:ind w:left="4320" w:hanging="360"/>
+      </w:pPr>
+      <w:rPr>
+        <w:rFonts w:ascii="Wingdings" w:hAnsi="Wingdings" w:hint="default"/>
+      </w:rPr>
+    </w:lvl>
+    <w:lvl w:ilvl="6" w:tplc="0C0A0001" w:tentative="1">
+      <w:start w:val="1"/>
+      <w:numFmt w:val="bullet"/>
+      <w:lvlText w:val=""/>
+      <w:lvlJc w:val="left"/>
+      <w:pPr>
+        <w:ind w:left="5040" w:hanging="360"/>
+      </w:pPr>
+      <w:rPr>
+        <w:rFonts w:ascii="Symbol" w:hAnsi="Symbol" w:hint="default"/>
+      </w:rPr>
+    </w:lvl>
+    <w:lvl w:ilvl="7" w:tplc="0C0A0003" w:tentative="1">
+      <w:start w:val="1"/>
+      <w:numFmt w:val="bullet"/>
+      <w:lvlText w:val="o"/>
+      <w:lvlJc w:val="left"/>
+      <w:pPr>
+        <w:ind w:left="5760" w:hanging="360"/>
+      </w:pPr>
+      <w:rPr>
+        <w:rFonts w:ascii="Courier New" w:hAnsi="Courier New" w:cs="Courier New" w:hint="default"/>
+      </w:rPr>
+    </w:lvl>
+    <w:lvl w:ilvl="8" w:tplc="0C0A0005" w:tentative="1">
+      <w:start w:val="1"/>
+      <w:numFmt w:val="bullet"/>
+      <w:lvlText w:val=""/>
+      <w:lvlJc w:val="left"/>
+      <w:pPr>
+        <w:ind w:left="6480" w:hanging="360"/>
+      </w:pPr>
+      <w:rPr>
+        <w:rFonts w:ascii="Wingdings" w:hAnsi="Wingdings" w:hint="default"/>
+      </w:rPr>
+    </w:lvl>
+  </w:abstractNum>
   <w:num w:numId="1" w16cid:durableId="144469802">
     <w:abstractNumId w:val="0"/>
     <w:lvlOverride w:ilvl="0">
       <w:startOverride w:val="1"/>
     </w:lvlOverride>
+  </w:num>
+  <w:num w:numId="2" w16cid:durableId="1261915937">
+    <w:abstractNumId w:val="1"/>
   </w:num>
 </w:numbering>
 </file>

</xml_diff>